<commit_message>
Prepare DOI-bearing ASO candidate for owned archive refresh
Unmarked preparation checkpoint. Adds actual reserved dataset DOI 10.5281/zenodo.22986104 to data availability/reference and editable manuscript. Science, declarations and first eight references unchanged. Pending state preserves factual initial upload hashes until refresh. Normal preflight passed on the working assembly; final exact-candidate Linux full verification remains pending. No archive publication, journal submission or preprint update.
</commit_message>
<xml_diff>
--- a/research/release-candidates/PUB-ASO/2026-09-26/submission/ASO-manuscript.docx
+++ b/research/release-candidates/PUB-ASO/2026-09-26/submission/ASO-manuscript.docx
@@ -281,7 +281,7 @@
         <w:spacing w:line="480" w:lineRule="auto"/>
       </w:pPr>
       <w:r>
-        <w:t>Supplementary Data contains versioned reference inputs, a junction-evidence table, all 40 design rows with five hypothetical controls explicitly flagged, tied normal-match locations, cutoff sensitivity results and reproducible Python code. Supplementary Methods explains the bounded read probe and provides retrieval instructions and hashes; the large read prefixes are retained in the local evidence record. The preceding catalogue is archived at https://doi.org/10.5281/zenodo.22229096. That historical deposit does not contain this revision's new analysis, and no new public deposition is claimed.</w:t>
+        <w:t>Supplementary Data contains versioned reference inputs, a junction-evidence table, all 40 design rows with five hypothetical controls explicitly flagged, tied normal-match locations, cutoff sensitivity results and reproducible Python code. Code, analysis inputs and results are also collected in the versioned data archive.[9] Supplementary Methods explains the bounded read probe and provides retrieval instructions and hashes; the large read prefixes are retained in the local evidence record. The preceding catalogue is archived at https://doi.org/10.5281/zenodo.22229096.</w:t>
       </w:r>
     </w:p>
     <w:p>
@@ -402,6 +402,14 @@
       </w:pPr>
       <w:r>
         <w:t>[8] Hedvat CV, Irving SG. The isolation and characterization of MINOR, a novel mitogen-inducible nuclear orphan receptor. Mol Endocrinol. 1995;9:1692–1700. https://pubmed.ncbi.nlm.nih.gov/8614405/; GenBank U12767.1.</w:t>
+      </w:r>
+    </w:p>
+    <w:p>
+      <w:pPr>
+        <w:spacing w:line="480" w:lineRule="auto"/>
+      </w:pPr>
+      <w:r>
+        <w:t>[9] McRae TD. Transcript provenance and normal-parent sequence comparisons for EMC fusion-junction antisense designs [dataset]. Zenodo; 2026. https://doi.org/10.5281/zenodo.22986104</w:t>
       </w:r>
     </w:p>
     <w:p>

</xml_diff>